<commit_message>
atualização modelo estratégia dev
</commit_message>
<xml_diff>
--- a/modelos/desenvolvimento/ModeloDev - Estratégia de solução.docx
+++ b/modelos/desenvolvimento/ModeloDev - Estratégia de solução.docx
@@ -322,7 +322,13 @@
               <w:spacing w:before="240" w:after="240"/>
             </w:pPr>
             <w:r>
-              <w:t>[DATA_ATUAL]</w:t>
+              <w:t>[DATA_</w:t>
+            </w:r>
+            <w:r>
+              <w:t>CRIACAO</w:t>
+            </w:r>
+            <w:r>
+              <w:t>]</w:t>
             </w:r>
           </w:p>
         </w:tc>
@@ -374,7 +380,13 @@
               <w:spacing w:before="240" w:after="240"/>
             </w:pPr>
             <w:r>
-              <w:t>[INICIAIS_AUTOR]</w:t>
+              <w:t>[INICIAIS_AUTOR</w:t>
+            </w:r>
+            <w:r>
+              <w:t>_CRIACAO</w:t>
+            </w:r>
+            <w:r>
+              <w:t>]</w:t>
             </w:r>
           </w:p>
         </w:tc>
@@ -851,7 +863,27 @@
           <w:sz w:val="28"/>
           <w:szCs w:val="28"/>
         </w:rPr>
-        <w:t>[TITULO]</w:t>
+        <w:t>[</w:t>
+      </w:r>
+      <w:proofErr w:type="gramStart"/>
+      <w:r>
+        <w:rPr>
+          <w:b/>
+          <w:bCs/>
+          <w:sz w:val="28"/>
+          <w:szCs w:val="28"/>
+        </w:rPr>
+        <w:t>TITULO</w:t>
+      </w:r>
+      <w:proofErr w:type="gramEnd"/>
+      <w:r>
+        <w:rPr>
+          <w:b/>
+          <w:bCs/>
+          <w:sz w:val="28"/>
+          <w:szCs w:val="28"/>
+        </w:rPr>
+        <w:t>]</w:t>
       </w:r>
     </w:p>
     <w:p>
@@ -912,7 +944,15 @@
         <w:t xml:space="preserve">: </w:t>
       </w:r>
       <w:r>
-        <w:t>[TITULO_RF]</w:t>
+        <w:t>[</w:t>
+      </w:r>
+      <w:proofErr w:type="gramStart"/>
+      <w:r>
+        <w:t>TITULO</w:t>
+      </w:r>
+      <w:proofErr w:type="gramEnd"/>
+      <w:r>
+        <w:t>_RF]</w:t>
       </w:r>
     </w:p>
     <w:tbl>
@@ -1303,7 +1343,15 @@
               <w:widowControl w:val="0"/>
             </w:pPr>
             <w:r>
-              <w:t>[REGRAS_NEGOCIO_RF]</w:t>
+              <w:t>[REGRAS_</w:t>
+            </w:r>
+            <w:proofErr w:type="gramStart"/>
+            <w:r>
+              <w:t>NEGOCIO</w:t>
+            </w:r>
+            <w:proofErr w:type="gramEnd"/>
+            <w:r>
+              <w:t>_RF]</w:t>
             </w:r>
           </w:p>
         </w:tc>
@@ -1413,7 +1461,15 @@
         <w:jc w:val="left"/>
       </w:pPr>
       <w:r>
-        <w:t>RNF-[N_RNF]: [TITULO_RNF]</w:t>
+        <w:t>RNF-[N_RNF]: [</w:t>
+      </w:r>
+      <w:proofErr w:type="gramStart"/>
+      <w:r>
+        <w:t>TITULO</w:t>
+      </w:r>
+      <w:proofErr w:type="gramEnd"/>
+      <w:r>
+        <w:t>_RNF]</w:t>
       </w:r>
     </w:p>
     <w:p>
@@ -1510,7 +1566,21 @@
       <w:rPr>
         <w:color w:val="666666"/>
       </w:rPr>
-      <w:t xml:space="preserve"> Rua Tereza Bezerra Salustino, 1901 - Lagoa Nova, Natal/RN, Sala 9, 59075-225</w:t>
+      <w:t xml:space="preserve"> Rua Tereza Bezerra </w:t>
+    </w:r>
+    <w:proofErr w:type="spellStart"/>
+    <w:r>
+      <w:rPr>
+        <w:color w:val="666666"/>
+      </w:rPr>
+      <w:t>Salustino</w:t>
+    </w:r>
+    <w:proofErr w:type="spellEnd"/>
+    <w:r>
+      <w:rPr>
+        <w:color w:val="666666"/>
+      </w:rPr>
+      <w:t>, 1901 - Lagoa Nova, Natal/RN, Sala 9, 59075-225</w:t>
     </w:r>
   </w:p>
   <w:p>
@@ -1677,7 +1747,21 @@
       <w:rPr>
         <w:color w:val="666666"/>
       </w:rPr>
-      <w:t xml:space="preserve"> Rua da Bronzita, 1917, Lagoa Nova, Natal/RN, Sala 3, 59.076-500</w:t>
+      <w:t xml:space="preserve"> Rua da </w:t>
+    </w:r>
+    <w:proofErr w:type="spellStart"/>
+    <w:r>
+      <w:rPr>
+        <w:color w:val="666666"/>
+      </w:rPr>
+      <w:t>Bronzita</w:t>
+    </w:r>
+    <w:proofErr w:type="spellEnd"/>
+    <w:r>
+      <w:rPr>
+        <w:color w:val="666666"/>
+      </w:rPr>
+      <w:t>, 1917, Lagoa Nova, Natal/RN, Sala 3, 59.076-500</w:t>
     </w:r>
   </w:p>
   <w:p>

</xml_diff>

<commit_message>
atualização no modelo de estratégia dev e no processamento de RFs
</commit_message>
<xml_diff>
--- a/modelos/desenvolvimento/ModeloDev - Estratégia de solução.docx
+++ b/modelos/desenvolvimento/ModeloDev - Estratégia de solução.docx
@@ -928,7 +928,7 @@
       <w:pPr>
         <w:pStyle w:val="Ttulo3"/>
         <w:widowControl w:val="0"/>
-        <w:spacing w:before="0" w:after="200"/>
+        <w:spacing w:before="0" w:after="0"/>
         <w:jc w:val="left"/>
       </w:pPr>
       <w:bookmarkStart w:id="16" w:name="_tufx1lf9idc4"/>
@@ -1174,7 +1174,7 @@
       </w:tr>
       <w:tr>
         <w:trPr>
-          <w:trHeight w:val="375"/>
+          <w:trHeight w:val="258"/>
         </w:trPr>
         <w:tc>
           <w:tcPr>
@@ -1187,6 +1187,7 @@
               <w:bottom w:w="100" w:type="dxa"/>
               <w:right w:w="100" w:type="dxa"/>
             </w:tcMar>
+            <w:vAlign w:val="center"/>
           </w:tcPr>
           <w:p>
             <w:pPr>
@@ -1234,7 +1235,7 @@
       </w:tr>
       <w:tr>
         <w:trPr>
-          <w:trHeight w:val="480"/>
+          <w:trHeight w:val="360"/>
         </w:trPr>
         <w:tc>
           <w:tcPr>
@@ -1247,10 +1248,12 @@
               <w:bottom w:w="100" w:type="dxa"/>
               <w:right w:w="100" w:type="dxa"/>
             </w:tcMar>
+            <w:vAlign w:val="center"/>
           </w:tcPr>
           <w:p>
             <w:pPr>
               <w:widowControl w:val="0"/>
+              <w:jc w:val="left"/>
               <w:rPr>
                 <w:b/>
               </w:rPr>
@@ -1292,7 +1295,7 @@
       </w:tr>
       <w:tr>
         <w:trPr>
-          <w:trHeight w:val="440"/>
+          <w:trHeight w:val="334"/>
         </w:trPr>
         <w:tc>
           <w:tcPr>
@@ -1305,10 +1308,12 @@
               <w:bottom w:w="100" w:type="dxa"/>
               <w:right w:w="100" w:type="dxa"/>
             </w:tcMar>
+            <w:vAlign w:val="center"/>
           </w:tcPr>
           <w:p>
             <w:pPr>
               <w:widowControl w:val="0"/>
+              <w:jc w:val="left"/>
               <w:rPr>
                 <w:b/>
               </w:rPr>
@@ -1358,7 +1363,7 @@
       </w:tr>
       <w:tr>
         <w:trPr>
-          <w:trHeight w:val="540"/>
+          <w:trHeight w:val="394"/>
         </w:trPr>
         <w:tc>
           <w:tcPr>
@@ -1371,6 +1376,7 @@
               <w:bottom w:w="100" w:type="dxa"/>
               <w:right w:w="100" w:type="dxa"/>
             </w:tcMar>
+            <w:vAlign w:val="center"/>
           </w:tcPr>
           <w:p>
             <w:pPr>

</xml_diff>